<commit_message>
New translations one-on-one time by developmental stages.docx (Papiamento)
</commit_message>
<xml_diff>
--- a/translations/plh_facilitator_cw/pap/pap_One-on-one time by developmental stages.docx
+++ b/translations/plh_facilitator_cw/pap/pap_One-on-one time by developmental stages.docx
@@ -157,7 +157,7 @@
         <w:pStyle w:val="P68B1DB1-Normal2"/>
       </w:pPr>
       <w:r>
-        <w:t xml:space="preserve">Na promé instante e por ta simplemente deskribí kiko ta pasando den detaye: e kantidat, e koló, e temperatura, e velosidat i e komportashon ta puntonan di salida útil: </w:t>
+        <w:t xml:space="preserve">Na promé instante simplemente deskribí kiko ta pasa den detaye: e kantidat, e koló, e temperatura, e velosidat i e komportashon por ta puntonan di salida útil: </w:t>
       </w:r>
     </w:p>
     <w:p>
@@ -294,7 +294,7 @@
         <w:pStyle w:val="P68B1DB1-Normal2"/>
       </w:pPr>
       <w:r>
-        <w:t xml:space="preserve">Kòrda, esaki ta e mucha su wega. No tin bon ni malu den wega i denter di loke ta rasonabel. Loke un mucha skohe pa hunga ta bon p'e. E mayor su trabou ta pa mustra interes i bisa algu bunita. </w:t>
+        <w:t xml:space="preserve">Kòrda, esaki ta e mucha su wega. No tin bon ni malu den wega i denter di loke ta rasonabel. Loke un mucha skohe pa hunga ta bon p'e. E mayor/edukadó su trabou ta pa mustra interes i bisa algu bunita. </w:t>
       </w:r>
     </w:p>
     <w:p>
@@ -324,19 +324,19 @@
         <w:pStyle w:val="P68B1DB1-Normal2"/>
       </w:pPr>
       <w:r>
-        <w:t xml:space="preserve">Debí na vários demanda ku mayornan/edukadónan i hóbennan ta topa diariamente, manera skol i trabou, tin bia por ta un reto pa haña tempu pa pasa tempu huntu. Un relashon fuerte entre mayor i yu no ta posibel sin pasa Tempu di kalidat Abo ku bo yu.  </w:t>
-      </w:r>
-    </w:p>
-    <w:p>
-      <w:pPr>
-        <w:spacing w:after="200" w:line="288" w:lineRule="auto"/>
-        <w:rPr>
-          <w:color w:val="013d5c"/>
-        </w:rPr>
-        <w:pStyle w:val="P68B1DB1-Normal2"/>
-      </w:pPr>
-      <w:r>
-        <w:t xml:space="preserve">Dediká tempu ta krea e espasio pa e mayor ta mas disponibel pa su yu i mayornan por hunga un ròl di duna protekshon den bida di nan yunan. Esaki ta yuda mayornan/edukadónan pa ta mas enbolbí den bida di nan adolesentenan, protehando nan di komportashonnan seksual riesgoso.  </w:t>
+        <w:t xml:space="preserve">Debí na vários demanda ku mayornan/edukadónan i hóbennan ta topa diariamente, manera skol i trabou, tin bia por ta un reto pa haña tempu pa pasa tempu huntu. Un relashon fuerte entre mayor/edukadó i yu no ta posibel sin pasa Tempu di kalidat -pa Abo-ku Bo yu.  </w:t>
+      </w:r>
+    </w:p>
+    <w:p>
+      <w:pPr>
+        <w:spacing w:after="200" w:line="288" w:lineRule="auto"/>
+        <w:rPr>
+          <w:color w:val="013d5c"/>
+        </w:rPr>
+        <w:pStyle w:val="P68B1DB1-Normal2"/>
+      </w:pPr>
+      <w:r>
+        <w:t xml:space="preserve">Dediká tempu ta krea e espasio pa e mayor/edukadó ta mas disponibel pa su yu i nan por hunga un ròl di duna protekshon den bida di nan yunan. Esaki ta yuda mayornan/edukadónan pa ta mas enbolbí den bida di nan adolesentenan, protehando nan di komportashonnan seksual riesgoso.  </w:t>
       </w:r>
     </w:p>
     <w:p>
@@ -386,7 +386,7 @@
         <w:pStyle w:val="P68B1DB1-Normal2"/>
       </w:pPr>
       <w:r>
-        <w:t xml:space="preserve">Un otro bon manera ku mayornan/edukadónan por desaroyá relashonnan positivo durante Tempu pa Abo ku bo Yu ta pa pasa tempu ku nan ora nan ta hasi algu ku nan ta gusta. Por ehèmpel, mira nan yunan hunga un partido deportivo òf mustra un moveshon nobo di baile. </w:t>
+        <w:t xml:space="preserve">Un otro bon manera ku mayornan/edukadónan por desaroyá relashonnan positivo durante Tempu pa Abo ku bo Yu ta pa pasa tempu ku nan ora nan ta hasi algu ku nan ta gusta. Por ehèmpel, wak nan yunan hunga un partido deportivo òf demostrá un moveshon nobo di baile. </w:t>
       </w:r>
     </w:p>
     <w:p>
@@ -453,7 +453,7 @@
         <w:pStyle w:val="P68B1DB1-Normal2"/>
       </w:pPr>
       <w:r>
-        <w:t xml:space="preserve">E sekshon aki ta duna informashon riba kon pa Laga Bo Yu Tuma Liderazgo pa mayornan ku un yu ku desabilidat. </w:t>
+        <w:t xml:space="preserve">E sekshon aki ta duna informashon riba e manera pa Laga Bo Yu Tuma Liderazgo pa mayornan ku un yu ku desabilidat. </w:t>
       </w:r>
     </w:p>
     <w:p>

</xml_diff>